<commit_message>
Dodaj generator dokumentów DOCX/XLSX oraz konfigurację Docker
- Nowa zakładka "Dokumenty" w panelu szczegółów kursu z pobieraniem plików
- Backend: widoki do generowania dokumentów (docxtpl + openpyxl) z danymi kursu
- Aktualizacja szablonów .docx z polami szablonowymi ({{ created_at }}, {{ address }} itp.)
- Zmiana etykiety "Miejscowość" → "Adres kursu" (pełny adres w jednym polu)
- Dodano docker-compose, Dockerfile, nginx, entrypoint.sh dla wdrożenia
- requirements.txt: docxtpl, openpyxl, gunicorn

Co-Authored-By: Claude Sonnet 4.6 <noreply@anthropic.com>
</commit_message>
<xml_diff>
--- a/pliki/Załącznik_nr_2 - 07-16.2025.docx
+++ b/pliki/Załącznik_nr_2 - 07-16.2025.docx
@@ -83,25 +83,7 @@
         <w:t xml:space="preserve">       Ełk, dn. </w:t>
       </w:r>
       <w:r>
-        <w:t>11</w:t>
-      </w:r>
-      <w:r>
-        <w:t>.</w:t>
-      </w:r>
-      <w:r>
-        <w:t>0</w:t>
-      </w:r>
-      <w:r>
-        <w:t>5</w:t>
-      </w:r>
-      <w:r>
-        <w:t>.202</w:t>
-      </w:r>
-      <w:r>
-        <w:t>6</w:t>
-      </w:r>
-      <w:r>
-        <w:t xml:space="preserve">                                                                </w:t>
+        <w:t>11.05.2026</w:t>
       </w:r>
     </w:p>
     <w:p>

</xml_diff>